<commit_message>
Fix ND30 spacing: tighter header, signature, section gaps
- check_nd30.py: add checks for Kính gửi italic/indent, separator, line spacing, Nơi nhận
- create_vbhc.py: tighten số ký hiệu/ngày tháng spacing (space_before=0), kính gửi after (6→3pt)
- mau_ templates: regenerate all 6 with updated spacing

Co-Authored-By: Claude Opus 4.7 <noreply@anthropic.com>
</commit_message>
<xml_diff>
--- a/.claude/skills/nd30-docx/assets/mau_bao_cao.docx
+++ b/.claude/skills/nd30-docx/assets/mau_bao_cao.docx
@@ -23,13 +23,13 @@
         </w:tblCellMar>
       </w:tblPr>
       <w:tblGrid>
-        <w:gridCol w:w="4535"/>
-        <w:gridCol w:w="4535"/>
+        <w:gridCol w:w="4677"/>
+        <w:gridCol w:w="4677"/>
       </w:tblGrid>
       <w:tr>
         <w:tc>
           <w:tcPr>
-            <w:tcW w:type="dxa" w:w="4082"/>
+            <w:tcW w:type="dxa" w:w="4209"/>
           </w:tcPr>
           <w:p>
             <w:pPr>
@@ -81,7 +81,7 @@
           </w:p>
           <w:p>
             <w:pPr>
-              <w:spacing w:before="120" w:after="0" w:line="240" w:lineRule="auto"/>
+              <w:spacing w:before="0" w:after="0" w:line="240" w:lineRule="auto"/>
               <w:jc w:val="center"/>
             </w:pPr>
             <w:r>
@@ -108,7 +108,7 @@
         </w:tc>
         <w:tc>
           <w:tcPr>
-            <w:tcW w:type="dxa" w:w="4989"/>
+            <w:tcW w:type="dxa" w:w="5145"/>
           </w:tcPr>
           <w:p>
             <w:pPr>
@@ -160,7 +160,7 @@
           </w:p>
           <w:p>
             <w:pPr>
-              <w:spacing w:before="120" w:after="0" w:line="240" w:lineRule="auto"/>
+              <w:spacing w:before="0" w:after="0" w:line="240" w:lineRule="auto"/>
               <w:jc w:val="center"/>
             </w:pPr>
             <w:r>
@@ -227,7 +227,7 @@
     </w:p>
     <w:p>
       <w:pPr>
-        <w:spacing w:before="240" w:after="120" w:line="240" w:lineRule="auto"/>
+        <w:spacing w:before="240" w:after="60" w:line="240" w:lineRule="auto"/>
         <w:ind w:firstLine="567"/>
         <w:jc w:val="left"/>
       </w:pPr>
@@ -459,13 +459,13 @@
         </w:tblCellMar>
       </w:tblPr>
       <w:tblGrid>
-        <w:gridCol w:w="4535"/>
-        <w:gridCol w:w="4535"/>
+        <w:gridCol w:w="4677"/>
+        <w:gridCol w:w="4677"/>
       </w:tblGrid>
       <w:tr>
         <w:tc>
           <w:tcPr>
-            <w:tcW w:type="dxa" w:w="4535"/>
+            <w:tcW w:type="dxa" w:w="4677"/>
           </w:tcPr>
           <w:p>
             <w:pPr>
@@ -550,7 +550,7 @@
         </w:tc>
         <w:tc>
           <w:tcPr>
-            <w:tcW w:type="dxa" w:w="4535"/>
+            <w:tcW w:type="dxa" w:w="4677"/>
           </w:tcPr>
           <w:p>
             <w:pPr>
@@ -649,7 +649,7 @@
     </w:tbl>
     <w:sectPr>
       <w:pgSz w:w="11906" w:h="16838"/>
-      <w:pgMar w:top="1417" w:right="1134" w:bottom="1417" w:left="1701" w:header="720" w:footer="720" w:gutter="0"/>
+      <w:pgMar w:top="1134" w:right="850" w:bottom="1134" w:left="1701" w:header="720" w:footer="720" w:gutter="0"/>
       <w:cols w:space="720"/>
       <w:titlePg/>
       <w:docGrid w:linePitch="360"/>

</xml_diff>